<commit_message>
Image Module Fix and Dropdown changes
</commit_message>
<xml_diff>
--- a/datasheet_gen/word_templates/RS_RI.docx
+++ b/datasheet_gen/word_templates/RS_RI.docx
@@ -1382,7 +1382,7 @@
           <w:p>
             <w:r/>
             <w:r>
-              <w:t>{{ frequency_range_col_1 }}</w:t>
+              <w:t>{{r frequency_range_col_1 }}</w:t>
             </w:r>
           </w:p>
         </w:tc>
@@ -1394,7 +1394,7 @@
           <w:p>
             <w:r/>
             <w:r>
-              <w:t>{{ frequency_range_col_2 }}</w:t>
+              <w:t>{{r frequency_range_col_2 }}</w:t>
             </w:r>
           </w:p>
         </w:tc>

</xml_diff>